<commit_message>
Docs: cover the rotating-export rework and the two audits, and add real solver figures
Simulator_Overview and both user guides gained the v4.0 turntable rework and a
summary of the copy and first-run reviews — the miscited references, the five
places 'exact' was attached to an approximate method, the fixed sustainability
score, the absorber hand-off that substituted a material silently, and the
rewritten instructions.

Each document also now carries three figures, which are unretouched output from
real openEMS solves already in fullwave_figures/ and horn_results/: a guided wave
in a coated waveguide, a horn's interior and radiated field in dB, and radar
scattering off a coated sphere. Cropped only to drop dead margins and one
auto-generated title that carried a user-typed material name; captions written
per document, and the Arabic ones in Arabic with RTL preserved.

Co-Authored-By: Claude Opus 5 <noreply@anthropic.com>
</commit_message>
<xml_diff>
--- a/Simulator_Overview.docx
+++ b/Simulator_Overview.docx
@@ -1443,6 +1443,174 @@
         <w:t>Finally, version 4.0 makes the radar-cross-section material list respect the construction being modelled. A coating's reflection loss is defined with metal behind it — that is what makes the absorber work — so offering a thin film as a solid homogeneous body asks the solver a different question from the one the material was characterised for, and the full-wave solver genuinely builds different geometry for the two. Materials pinned as coatings are therefore offered only for a coated construction, and materials pinned as solid bodies only for a solid one, with the list stating which kind is missing when it is empty.</w:t>
       </w:r>
     </w:p>
+    <w:p>
+      <w:r>
+        <w:t>Version 4.0 closes with two capability additions and a documentation pass. The rotating exports were rebuilt from the ground up after they were found to be showing a stationary object: the capture recoloured the model for each look angle but never turned it, so both the animated GIF and the interactive page were a fixed silhouette with changing colours. The turntable now rotates the geometry itself through a full circle, lays the model's longest dimension horizontally so nothing is cut off, computes the camera distance exactly from the field of view rather than by trial, renders at a fixed frame size so the result is identical on every machine, and lightens the shading of surfaces facing away so the object stays visible for the whole revolution instead of disappearing into the background for half of it.</w:t>
+      </w:r>
+    </w:p>
+    <w:p>
+      <w:r>
+        <w:t>Two further review passes went over every word the interface shows the user and over the experience of opening the tool for the first time with no saved state. Between them they corrected three citations that pointed at the wrong paper, three malformed reference entries, and five places where the word “exact” had been attached to an approximate method — a contradiction with the tool’s own honest statement, elsewhere, that the same method can be badly wrong at grazing angles. A composite “sustainability” score on the comparison chart was found to be a fixed number that did not follow a user-defined material, and is now labelled as such. The hand-off that sends an absorber design to the full-wave solver was substituting a stand-in material without saying so, and now states plainly that the full-wave result will not reproduce the figure quoted. The written instructions, which had documented ten of the twenty-one pages and described a setup procedure that no longer applied, were rewritten in full.</w:t>
+      </w:r>
+    </w:p>
+    <w:p>
+      <w:r>
+        <w:t>The three figures below are unretouched output from the full-wave solver, produced by the pipeline described above and reproduced here at the resolution the tool writes them.</w:t>
+      </w:r>
+    </w:p>
+    <w:p>
+      <w:pPr>
+        <w:jc w:val="center"/>
+      </w:pPr>
+      <w:r>
+        <w:drawing>
+          <wp:inline xmlns:a="http://schemas.openxmlformats.org/drawingml/2006/main" xmlns:pic="http://schemas.openxmlformats.org/drawingml/2006/picture">
+            <wp:extent cx="5852160" cy="1941853"/>
+            <wp:docPr id="2" name="Picture 2"/>
+            <wp:cNvGraphicFramePr>
+              <a:graphicFrameLocks noChangeAspect="1"/>
+            </wp:cNvGraphicFramePr>
+            <a:graphic>
+              <a:graphicData uri="http://schemas.openxmlformats.org/drawingml/2006/picture">
+                <pic:pic>
+                  <pic:nvPicPr>
+                    <pic:cNvPr id="0" name="fig_waveguide_field.png"/>
+                    <pic:cNvPicPr/>
+                  </pic:nvPicPr>
+                  <pic:blipFill>
+                    <a:blip r:embed="rId11"/>
+                    <a:stretch>
+                      <a:fillRect/>
+                    </a:stretch>
+                  </pic:blipFill>
+                  <pic:spPr>
+                    <a:xfrm>
+                      <a:off x="0" y="0"/>
+                      <a:ext cx="5852160" cy="1941853"/>
+                    </a:xfrm>
+                    <a:prstGeom prst="rect"/>
+                  </pic:spPr>
+                </pic:pic>
+              </a:graphicData>
+            </a:graphic>
+          </wp:inline>
+        </w:drawing>
+      </w:r>
+    </w:p>
+    <w:p>
+      <w:pPr>
+        <w:jc w:val="center"/>
+      </w:pPr>
+      <w:r>
+        <w:rPr>
+          <w:i/>
+          <w:sz w:val="18"/>
+        </w:rPr>
+        <w:t>Guided wave inside a lightweight coated waveguide, X-band. Peak electric-field envelope from a three-dimensional openEMS solve; brightness is field carried, fading toward the walls is power lost into them.</w:t>
+      </w:r>
+    </w:p>
+    <w:p>
+      <w:pPr>
+        <w:jc w:val="center"/>
+      </w:pPr>
+      <w:r>
+        <w:drawing>
+          <wp:inline xmlns:a="http://schemas.openxmlformats.org/drawingml/2006/main" xmlns:pic="http://schemas.openxmlformats.org/drawingml/2006/picture">
+            <wp:extent cx="5486400" cy="2594919"/>
+            <wp:docPr id="3" name="Picture 3"/>
+            <wp:cNvGraphicFramePr>
+              <a:graphicFrameLocks noChangeAspect="1"/>
+            </wp:cNvGraphicFramePr>
+            <a:graphic>
+              <a:graphicData uri="http://schemas.openxmlformats.org/drawingml/2006/picture">
+                <pic:pic>
+                  <pic:nvPicPr>
+                    <pic:cNvPr id="0" name="fig_horn_field.png"/>
+                    <pic:cNvPicPr/>
+                  </pic:nvPicPr>
+                  <pic:blipFill>
+                    <a:blip r:embed="rId12"/>
+                    <a:stretch>
+                      <a:fillRect/>
+                    </a:stretch>
+                  </pic:blipFill>
+                  <pic:spPr>
+                    <a:xfrm>
+                      <a:off x="0" y="0"/>
+                      <a:ext cx="5486400" cy="2594919"/>
+                    </a:xfrm>
+                    <a:prstGeom prst="rect"/>
+                  </pic:spPr>
+                </pic:pic>
+              </a:graphicData>
+            </a:graphic>
+          </wp:inline>
+        </w:drawing>
+      </w:r>
+    </w:p>
+    <w:p>
+      <w:pPr>
+        <w:jc w:val="center"/>
+      </w:pPr>
+      <w:r>
+        <w:rPr>
+          <w:i/>
+          <w:sz w:val="18"/>
+        </w:rPr>
+        <w:t>Horn antenna, interior and radiated field on a decibel scale. The guided mode enters the narrow feed at left, expands through the flare, and leaves the aperture as spherical wavefronts.</w:t>
+      </w:r>
+    </w:p>
+    <w:p>
+      <w:pPr>
+        <w:jc w:val="center"/>
+      </w:pPr>
+      <w:r>
+        <w:drawing>
+          <wp:inline xmlns:a="http://schemas.openxmlformats.org/drawingml/2006/main" xmlns:pic="http://schemas.openxmlformats.org/drawingml/2006/picture">
+            <wp:extent cx="3931920" cy="2954898"/>
+            <wp:docPr id="4" name="Picture 4"/>
+            <wp:cNvGraphicFramePr>
+              <a:graphicFrameLocks noChangeAspect="1"/>
+            </wp:cNvGraphicFramePr>
+            <a:graphic>
+              <a:graphicData uri="http://schemas.openxmlformats.org/drawingml/2006/picture">
+                <pic:pic>
+                  <pic:nvPicPr>
+                    <pic:cNvPr id="0" name="fig_rcs_field.png"/>
+                    <pic:cNvPicPr/>
+                  </pic:nvPicPr>
+                  <pic:blipFill>
+                    <a:blip r:embed="rId13"/>
+                    <a:stretch>
+                      <a:fillRect/>
+                    </a:stretch>
+                  </pic:blipFill>
+                  <pic:spPr>
+                    <a:xfrm>
+                      <a:off x="0" y="0"/>
+                      <a:ext cx="3931920" cy="2954898"/>
+                    </a:xfrm>
+                    <a:prstGeom prst="rect"/>
+                  </pic:spPr>
+                </pic:pic>
+              </a:graphicData>
+            </a:graphic>
+          </wp:inline>
+        </w:drawing>
+      </w:r>
+    </w:p>
+    <w:p>
+      <w:pPr>
+        <w:jc w:val="center"/>
+      </w:pPr>
+      <w:r>
+        <w:rPr>
+          <w:i/>
+          <w:sz w:val="18"/>
+        </w:rPr>
+        <w:t>Radar scattering from a coated sphere, X-band. Peak field envelope showing the standing-wave pattern ahead of the target, the shadow behind it, and the lobe scattered back toward the radar.</w:t>
+      </w:r>
+    </w:p>
     <w:sectPr>
       <w:pgSz w:w="12240" w:h="15840" w:orient="portrait"/>
       <w:pgMar w:top="1440" w:right="1440" w:bottom="1440" w:left="1440" w:header="708" w:footer="708" w:gutter="0"/>

</xml_diff>